<commit_message>
Update: course development, digital transformation, documentation, and translation work — 2026-02-14
</commit_message>
<xml_diff>
--- a/course_development/active_inference_family/02_tiny_bodies_big_brains/08_planning/output/lab-protocols/08_planning-lab.docx
+++ b/course_development/active_inference_family/02_tiny_bodies_big_brains/08_planning/output/lab-protocols/08_planning-lab.docx
@@ -4,32 +4,88 @@
   <w:body>
     <w:p>
       <w:r>
-        <w:t>Lab: Exploring Planning</w:t>
+        <w:t>Lab: The Routine Chart</w:t>
       </w:r>
     </w:p>
     <w:p>
       <w:r>
-        <w:t>Objective</w:t>
+        <w:t>Goal</w:t>
       </w:r>
     </w:p>
     <w:p>
       <w:r>
-        <w:t>Design and simulate a simple agent that demonstrates the principles of Planning .</w:t>
+        <w:t>To visualize the Bedtime Algorithm.</w:t>
       </w:r>
     </w:p>
     <w:p>
       <w:r>
-        <w:t>Prerequisites</w:t>
+        <w:t>What You Need</w:t>
       </w:r>
     </w:p>
     <w:p>
       <w:r>
-        <w:t>Basic understanding of Python or a relevant simulation tool.  Familiarity with the formal definition of Planning.   Steps</w:t>
+        <w:t>Paper or Cardboard.  Markers/Crayons.  Stickers (optional).   Steps</w:t>
       </w:r>
     </w:p>
     <w:p>
       <w:r>
-        <w:t>Define the Environment : Create a simple grid world or state space relevant to Family.  Define the Agent : Specify the agent's generative model, focusing on Planning.  Simulation : Run the agent for 100 timesteps.  Perturbation : Introduce a specific challenge to Planning (e.g., increased noise, occlusion).  Analysis : Plot the Free Energy over time. Does the agent successfully adapt?   Discussion Requirements</w:t>
+        <w:t>1. Identify the Steps</w:t>
+      </w:r>
+    </w:p>
+    <w:p>
+      <w:r>
+        <w:t>Talk about what you do every night.</w:t>
+      </w:r>
+    </w:p>
+    <w:p>
+      <w:r>
+        <w:t>Bath/Wash Face.  Brush Teeth.  Pajamas.  Read Book.  Hugs &amp; Lights Out.   2. Draw the Icons</w:t>
+      </w:r>
+    </w:p>
+    <w:p>
+      <w:r>
+        <w:t>Draw a little picture for each step.</w:t>
+      </w:r>
+    </w:p>
+    <w:p>
+      <w:r>
+        <w:t>Toothbrush.  Book.  Moon.   3. Make the Checklist</w:t>
+      </w:r>
+    </w:p>
+    <w:p>
+      <w:r>
+        <w:t>Put them in a row or list.</w:t>
+        <w:br/>
+        <w:t>Draw a box next to each one.</w:t>
+      </w:r>
+    </w:p>
+    <w:p>
+      <w:r>
+        <w:t>4. The Beta Test</w:t>
+      </w:r>
+    </w:p>
+    <w:p>
+      <w:r>
+        <w:t>Tonight, use the chart!</w:t>
+        <w:br/>
+        <w:t>When you finish a step, put a checkmark (or sticker) in the box.</w:t>
+        <w:br/>
+        <w:t>"Algorithm Complete."</w:t>
+      </w:r>
+    </w:p>
+    <w:p>
+      <w:r>
+        <w:t>Discussion</w:t>
+      </w:r>
+    </w:p>
+    <w:p>
+      <w:r>
+        <w:t>Did checking the boxes feel good? (Dopamine!).  Did you forget anything?  Now your brain knows exactly when sleep is coming.   What We Learned</w:t>
+      </w:r>
+    </w:p>
+    <w:p>
+      <w:r>
+        <w:t>Planning is just making a map for your future self.</w:t>
       </w:r>
     </w:p>
     <w:sectPr>

</xml_diff>